<commit_message>
update —— (2026-10-30 19:23:32)
</commit_message>
<xml_diff>
--- a/Debian_GNOME_Init/3/模板/DOCX-30行距.docx
+++ b/Debian_GNOME_Init/3/模板/DOCX-30行距.docx
@@ -1,6 +1,6 @@
 
 <file path=word/document.xml><?xml version="1.0" encoding="utf-8"?>
-<w:document xmlns:wpc="http://schemas.microsoft.com/office/word/2010/wordprocessingCanvas" xmlns:mc="http://schemas.openxmlformats.org/markup-compatibility/2006" xmlns:o="urn:schemas-microsoft-com:office:office" xmlns:r="http://schemas.openxmlformats.org/officeDocument/2006/relationships" xmlns:m="http://schemas.openxmlformats.org/officeDocument/2006/math" xmlns:v="urn:schemas-microsoft-com:vml" xmlns:wp14="http://schemas.microsoft.com/office/word/2010/wordprocessingDrawing" xmlns:wp="http://schemas.openxmlformats.org/drawingml/2006/wordprocessingDrawing" xmlns:w="http://schemas.openxmlformats.org/wordprocessingml/2006/main" xmlns:w14="http://schemas.microsoft.com/office/word/2010/wordml" xmlns:w10="urn:schemas-microsoft-com:office:word" xmlns:w15="http://schemas.microsoft.com/office/word/2012/wordml" xmlns:wpg="http://schemas.microsoft.com/office/word/2010/wordprocessingGroup" xmlns:wpi="http://schemas.microsoft.com/office/word/2010/wordprocessingInk" xmlns:wne="http://schemas.microsoft.com/office/word/2006/wordml" xmlns:wps="http://schemas.microsoft.com/office/word/2010/wordprocessingShape" xmlns:wpsCustomData="http://www.wps.cn/officeDocument/2013/wpsCustomData" mc:Ignorable="w14 w15 wp14">
+<w:document xmlns:wpc="http://schemas.microsoft.com/office/word/2010/wordprocessingCanvas" xmlns:cx="http://schemas.microsoft.com/office/drawing/2014/chartex" xmlns:cx1="http://schemas.microsoft.com/office/drawing/2015/9/8/chartex" xmlns:cx2="http://schemas.microsoft.com/office/drawing/2015/10/21/chartex" xmlns:cx3="http://schemas.microsoft.com/office/drawing/2016/5/9/chartex" xmlns:cx4="http://schemas.microsoft.com/office/drawing/2016/5/10/chartex" xmlns:cx5="http://schemas.microsoft.com/office/drawing/2016/5/11/chartex" xmlns:cx6="http://schemas.microsoft.com/office/drawing/2016/5/12/chartex" xmlns:cx7="http://schemas.microsoft.com/office/drawing/2016/5/13/chartex" xmlns:cx8="http://schemas.microsoft.com/office/drawing/2016/5/14/chartex" xmlns:mc="http://schemas.openxmlformats.org/markup-compatibility/2006" xmlns:o="urn:schemas-microsoft-com:office:office" xmlns:r="http://schemas.openxmlformats.org/officeDocument/2006/relationships" xmlns:m="http://schemas.openxmlformats.org/officeDocument/2006/math" xmlns:v="urn:schemas-microsoft-com:vml" xmlns:wp14="http://schemas.microsoft.com/office/word/2010/wordprocessingDrawing" xmlns:wp="http://schemas.openxmlformats.org/drawingml/2006/wordprocessingDrawing" xmlns:w="http://schemas.openxmlformats.org/wordprocessingml/2006/main" xmlns:w14="http://schemas.microsoft.com/office/word/2010/wordml" xmlns:w10="urn:schemas-microsoft-com:office:word" xmlns:w15="http://schemas.microsoft.com/office/word/2012/wordml" xmlns:wpg="http://schemas.microsoft.com/office/word/2010/wordprocessingGroup" xmlns:wpi="http://schemas.microsoft.com/office/word/2010/wordprocessingInk" xmlns:wne="http://schemas.microsoft.com/office/word/2006/wordml" xmlns:wps="http://schemas.microsoft.com/office/word/2010/wordprocessingShape" xmlns:wpsCustomData="http://www.wps.cn/officeDocument/2013/wpsCustomData" mc:Ignorable="w14 w15 wp14">
   <w:body>
     <w:p>
       <w:pPr>
@@ -57,8 +57,6 @@
         </w:rPr>
         <w:t>GB2312</w:t>
       </w:r>
-      <w:bookmarkStart w:id="11" w:name="_GoBack"/>
-      <w:bookmarkEnd w:id="11"/>
     </w:p>
     <w:p>
       <w:pPr>
@@ -119,6 +117,8 @@
         </w:rPr>
         <w:t>汇编方正小标宋</w:t>
       </w:r>
+      <w:bookmarkStart w:id="11" w:name="_GoBack"/>
+      <w:bookmarkEnd w:id="11"/>
     </w:p>
     <w:p>
       <w:pPr>
@@ -228,8 +228,8 @@
         </w:rPr>
       </w:pPr>
       <w:bookmarkStart w:id="0" w:name="_Toc729529132"/>
-      <w:bookmarkStart w:id="1" w:name="_Toc123187978"/>
-      <w:bookmarkStart w:id="2" w:name="_Toc2057989189"/>
+      <w:bookmarkStart w:id="1" w:name="_Toc2057989189"/>
+      <w:bookmarkStart w:id="2" w:name="_Toc123187978"/>
       <w:r>
         <w:rPr>
           <w:rFonts w:hint="eastAsia"/>
@@ -287,10 +287,10 @@
           <w:lang w:val="en-US" w:eastAsia="zh-CN"/>
         </w:rPr>
       </w:pPr>
-      <w:bookmarkStart w:id="3" w:name="_Toc1946097949"/>
-      <w:bookmarkStart w:id="4" w:name="_Toc1137365203"/>
-      <w:bookmarkStart w:id="5" w:name="_Toc188993031"/>
-      <w:bookmarkStart w:id="6" w:name="_Toc1206386538"/>
+      <w:bookmarkStart w:id="3" w:name="_Toc1137365203"/>
+      <w:bookmarkStart w:id="4" w:name="_Toc1946097949"/>
+      <w:bookmarkStart w:id="5" w:name="_Toc1206386538"/>
+      <w:bookmarkStart w:id="6" w:name="_Toc188993031"/>
       <w:r>
         <w:rPr>
           <w:rFonts w:hint="eastAsia"/>
@@ -345,10 +345,10 @@
           <w:lang w:val="en-US" w:eastAsia="zh-CN"/>
         </w:rPr>
       </w:pPr>
-      <w:bookmarkStart w:id="7" w:name="_Toc1298874793"/>
-      <w:bookmarkStart w:id="8" w:name="_Toc12900356"/>
-      <w:bookmarkStart w:id="9" w:name="_Toc1270592752"/>
-      <w:bookmarkStart w:id="10" w:name="_Toc182799226"/>
+      <w:bookmarkStart w:id="7" w:name="_Toc12900356"/>
+      <w:bookmarkStart w:id="8" w:name="_Toc182799226"/>
+      <w:bookmarkStart w:id="9" w:name="_Toc1298874793"/>
+      <w:bookmarkStart w:id="10" w:name="_Toc1270592752"/>
       <w:r>
         <w:rPr>
           <w:rFonts w:hint="default"/>
@@ -1146,7 +1146,8 @@
     <w:pPr>
       <w:widowControl w:val="0"/>
       <w:spacing w:line="600" w:lineRule="exact"/>
-      <w:jc w:val="left"/>
+      <w:ind w:firstLine="0" w:firstLineChars="0"/>
+      <w:jc w:val="both"/>
     </w:pPr>
     <w:rPr>
       <w:rFonts w:ascii="仿宋_GB2312" w:hAnsi="仿宋_GB2312" w:eastAsia="仿宋_GB2312" w:cstheme="minorBidi"/>
@@ -1167,8 +1168,8 @@
       <w:keepLines/>
       <w:spacing w:beforeLines="0" w:beforeAutospacing="0" w:afterLines="0" w:afterAutospacing="0" w:line="600" w:lineRule="exact"/>
       <w:ind w:firstLine="880" w:firstLineChars="200"/>
-      <w:jc w:val="left"/>
-      <w:outlineLvl w:val="1"/>
+      <w:jc w:val="both"/>
+      <w:outlineLvl w:val="0"/>
     </w:pPr>
     <w:rPr>
       <w:rFonts w:ascii="黑体" w:hAnsi="黑体" w:eastAsia="黑体"/>
@@ -1187,8 +1188,8 @@
       <w:keepLines/>
       <w:spacing w:beforeLines="0" w:beforeAutospacing="0" w:afterLines="0" w:afterAutospacing="0" w:line="600" w:lineRule="exact"/>
       <w:ind w:firstLine="880" w:firstLineChars="200"/>
-      <w:jc w:val="left"/>
-      <w:outlineLvl w:val="2"/>
+      <w:jc w:val="both"/>
+      <w:outlineLvl w:val="1"/>
     </w:pPr>
     <w:rPr>
       <w:rFonts w:ascii="楷体_GB2312" w:hAnsi="楷体_GB2312" w:eastAsia="楷体_GB2312"/>
@@ -1207,8 +1208,8 @@
       <w:keepLines/>
       <w:spacing w:beforeLines="0" w:beforeAutospacing="0" w:afterLines="0" w:afterAutospacing="0" w:line="600" w:lineRule="exact"/>
       <w:ind w:firstLine="880" w:firstLineChars="200"/>
-      <w:jc w:val="left"/>
-      <w:outlineLvl w:val="3"/>
+      <w:jc w:val="both"/>
+      <w:outlineLvl w:val="2"/>
     </w:pPr>
     <w:rPr>
       <w:rFonts w:ascii="仿宋_GB2312" w:hAnsi="仿宋_GB2312" w:eastAsia="仿宋_GB2312"/>
@@ -1227,8 +1228,8 @@
       <w:keepLines/>
       <w:spacing w:beforeLines="0" w:beforeAutospacing="0" w:afterLines="0" w:afterAutospacing="0" w:line="600" w:lineRule="exact"/>
       <w:ind w:firstLine="880" w:firstLineChars="200"/>
-      <w:jc w:val="left"/>
-      <w:outlineLvl w:val="4"/>
+      <w:jc w:val="both"/>
+      <w:outlineLvl w:val="3"/>
     </w:pPr>
     <w:rPr>
       <w:rFonts w:ascii="仿宋_GB2312" w:hAnsi="仿宋_GB2312" w:eastAsia="仿宋_GB2312"/>
@@ -1245,7 +1246,7 @@
       <w:keepNext/>
       <w:keepLines/>
       <w:spacing w:beforeLines="0" w:beforeAutospacing="0" w:afterLines="0" w:afterAutospacing="0" w:line="600" w:lineRule="exact"/>
-      <w:outlineLvl w:val="5"/>
+      <w:outlineLvl w:val="4"/>
     </w:pPr>
     <w:rPr>
       <w:rFonts w:ascii="仿宋_GB2312" w:hAnsi="仿宋_GB2312" w:eastAsia="仿宋_GB2312"/>

</xml_diff>